<commit_message>
Fix restore directory selection and WeGame detection
</commit_message>
<xml_diff>
--- a/docs/使用文档.docx
+++ b/docs/使用文档.docx
@@ -12,7 +12,7 @@
           <w:b/>
           <w:sz w:val="40"/>
         </w:rPr>
-        <w:t>POE2 三服合一物价补丁使用文档</w:t>
+        <w:t>POE2 三服合一物价补丁使用文档 v0.4.9.6</w:t>
       </w:r>
     </w:p>
     <w:p>
@@ -57,7 +57,7 @@
           <w:color w:val="C00000"/>
           <w:sz w:val="28"/>
         </w:rPr>
-        <w:t>程序会自动识别国服 WeGame、国际服官方 GGPK、国际服 Steam/Epic Bundles2。</w:t>
+        <w:t>更新和还原都会自动识别国服 WeGame、国际服官方 GGPK、国际服 Steam/Epic Bundles2，也可以手动选择游戏目录。</w:t>
       </w:r>
     </w:p>
     <w:p>
@@ -96,7 +96,7 @@
           <w:b w:val="0"/>
           <w:sz w:val="22"/>
         </w:rPr>
-        <w:t>把整个“物价补丁”文件夹放到 POE2 游戏根目录。脚本会自动识别上一级目录，不写死盘符。</w:t>
+        <w:t>“物价补丁”文件夹可以放在任意位置。放在游戏根目录下仍可最快识别；放在其它位置时，程序会检查最近目录和各平台游戏库，也可以手动浏览。</w:t>
       </w:r>
     </w:p>
     <w:p>
@@ -415,7 +415,7 @@
           <w:b/>
           <w:sz w:val="26"/>
         </w:rPr>
-        <w:t>二、自动识别</w:t>
+        <w:t>二、选择与自动识别游戏目录</w:t>
       </w:r>
     </w:p>
     <w:p>
@@ -428,7 +428,7 @@
           <w:rFonts w:ascii="微软雅黑" w:hAnsi="微软雅黑" w:eastAsia="微软雅黑"/>
           <w:sz w:val="22"/>
         </w:rPr>
-        <w:t>检测到 Content.ggpk：按国际服官方 GGPK 处理。</w:t>
+        <w:t>自动模式依次检查补丁文件夹上一级、环境变量、最近有效目录、已安装程序、WeGame/Steam 游戏库、Epic 清单和常见位置。</w:t>
       </w:r>
     </w:p>
     <w:p>
@@ -441,7 +441,7 @@
           <w:rFonts w:ascii="微软雅黑" w:hAnsi="微软雅黑" w:eastAsia="微软雅黑"/>
           <w:sz w:val="22"/>
         </w:rPr>
-        <w:t>检测到 Bundles2 且有 WeGame/腾讯文件特征：按国服 WeGame Bundles2 处理。</w:t>
+        <w:t>国服会匹配“流放之路：降临”和 WeGameApps\rail_apps 游戏库；目录还必须包含 Bundles2\_.index.bin，并通过 WeGame/Rail/Tencent 特征确认。</w:t>
       </w:r>
     </w:p>
     <w:p>
@@ -454,7 +454,7 @@
           <w:rFonts w:ascii="微软雅黑" w:hAnsi="微软雅黑" w:eastAsia="微软雅黑"/>
           <w:sz w:val="22"/>
         </w:rPr>
-        <w:t>检测到 Bundles2 且没有 WeGame/腾讯文件特征：按国际服 Steam/Epic Bundles2 处理。</w:t>
+        <w:t>检测到 Content.ggpk 时按国际服官方 GGPK 处理；检测到非国服特征的 Bundles2 时按国际服 Steam/Epic 处理。</w:t>
       </w:r>
     </w:p>
     <w:p>
@@ -467,7 +467,7 @@
           <w:rFonts w:ascii="微软雅黑" w:hAnsi="微软雅黑" w:eastAsia="微软雅黑"/>
           <w:sz w:val="22"/>
         </w:rPr>
-        <w:t>国际服会读取当前游戏 language 设置，自动写入对应语言的 BaseItemTypes。</w:t>
+        <w:t>如果发现多个客户端，程序不会猜测，请切换到手动选择。确认后的有效目录会保存，更新与还原下次可复用。国际服仍会读取 language 设置。</w:t>
       </w:r>
     </w:p>
     <w:p>
@@ -533,7 +533,7 @@
           <w:rFonts w:ascii="微软雅黑" w:hAnsi="微软雅黑" w:eastAsia="微软雅黑"/>
           <w:sz w:val="22"/>
         </w:rPr>
-        <w:t>3. 程序会提取英文表和当前客户端目标语言表。</w:t>
+        <w:t>3. 在窗口中确认自动识别的路径和客户端类型，或切换到手动选择；更新器还需选择补丁范围。随后程序提取英文表和当前客户端目标语言表。</w:t>
       </w:r>
     </w:p>
     <w:p>
@@ -606,7 +606,7 @@
           <w:rFonts w:ascii="微软雅黑" w:hAnsi="微软雅黑" w:eastAsia="微软雅黑"/>
           <w:sz w:val="22"/>
         </w:rPr>
-        <w:t>2. 双击“一键还原物价补丁.exe”。</w:t>
+        <w:t>2. 双击“一键还原物价补丁.exe”，在还原窗口中确认自动识别的路径和客户端类型，或手动选择要还原的游戏目录。</w:t>
       </w:r>
     </w:p>
     <w:p>
@@ -951,7 +951,7 @@
           <w:rFonts w:ascii="微软雅黑" w:hAnsi="微软雅黑" w:eastAsia="微软雅黑"/>
           <w:sz w:val="22"/>
         </w:rPr>
-        <w:t>提示找不到游戏目录：请确认物价补丁文件夹放在 POE2 游戏根目录。</w:t>
+        <w:t>提示找不到游戏目录：改用手动选择，并选择直接包含 Content.ggpk 或 Bundles2\_.index.bin 的游戏根目录；不要选择物价补丁文件夹。多个客户端必须明确选择。若旧补丁有标记但备份丢失，新版会搜索旧文件夹并尝试离线沙盒迁移；失败时真实游戏不会被修改。</w:t>
       </w:r>
     </w:p>
     <w:p>
@@ -1042,7 +1042,7 @@
         <w:color w:val="808080"/>
         <w:sz w:val="18"/>
       </w:rPr>
-      <w:t>POE2 三服合一物价补丁</w:t>
+      <w:t>POE2 三服合一物价补丁 v0.4.9.6</w:t>
     </w:r>
   </w:p>
 </w:ftr>
@@ -1859,7 +1859,6 @@
         <w:ilvl w:val="0"/>
         <w:numId w:val="3"/>
       </w:numPr>
-      <w:contextualSpacing/>
     </w:pPr>
   </w:style>
   <w:style w:type="paragraph" w:styleId="17">

</xml_diff>